<commit_message>
Implement F1 course validation and creation
實作課程資料驗證與新增功能，檢查欄位、資料型別、合法時段與重複代號。新增課程時使用深層複製，避免資料意外共用，並同步更新函式實作狀態。
</commit_message>
<xml_diff>
--- a/docs/function_interface.docx
+++ b/docs/function_interface.docx
@@ -35,7 +35,7 @@
           <w:color w:val="000000"/>
           <w:sz w:val="20"/>
         </w:rPr>
-        <w:t>校園選課與課表規劃系統  |  契約 1.0  |  文件 1.1  |  2026/10/16</w:t>
+        <w:t>校園選課與課表規劃系統  |  契約 1.0  |  文件 1.2  |  2026/10/16</w:t>
       </w:r>
     </w:p>
     <w:p>
@@ -219,7 +219,7 @@
                 <w:color w:val="000000"/>
                 <w:sz w:val="21"/>
               </w:rPr>
-              <w:t>尚未實作</w:t>
+              <w:t>已實作</w:t>
             </w:r>
           </w:p>
         </w:tc>
@@ -287,7 +287,7 @@
                 <w:color w:val="000000"/>
                 <w:sz w:val="21"/>
               </w:rPr>
-              <w:t>尚未實作</w:t>
+              <w:t>已實作</w:t>
             </w:r>
           </w:p>
         </w:tc>
@@ -7058,7 +7058,7 @@
           <w:color w:val="000000"/>
           <w:sz w:val="18"/>
         </w:rPr>
-        <w:t>來源：SDD 3.1 與 2026/10/16 已確認決策。契約版本維持 1.0，本次文件修訂為 1.1。</w:t>
+        <w:t>來源：SDD 3.1 與 2026/10/16 已確認決策。契約版本維持 1.0，本次文件修訂為 1.2。</w:t>
       </w:r>
     </w:p>
     <w:sectPr>

</xml_diff>

<commit_message>
Implement course updates and deletion constraints
實作課程修改、刪除限制檢查及刪除功能，確保資料驗證通過後才更新，拒絕不合法的修改，並在刪除時重新確認學生選課關聯。
</commit_message>
<xml_diff>
--- a/docs/function_interface.docx
+++ b/docs/function_interface.docx
@@ -35,7 +35,7 @@
           <w:color w:val="000000"/>
           <w:sz w:val="20"/>
         </w:rPr>
-        <w:t>校園選課與課表規劃系統  |  契約 1.0  |  文件 1.2  |  2026/10/16</w:t>
+        <w:t>校園選課與課表規劃系統  |  契約 1.1  |  文件 1.3  |  2026/10/16</w:t>
       </w:r>
     </w:p>
     <w:p>
@@ -355,7 +355,7 @@
                 <w:color w:val="000000"/>
                 <w:sz w:val="21"/>
               </w:rPr>
-              <w:t>尚未實作</w:t>
+              <w:t>已實作</w:t>
             </w:r>
           </w:p>
         </w:tc>
@@ -423,7 +423,7 @@
                 <w:color w:val="000000"/>
                 <w:sz w:val="21"/>
               </w:rPr>
-              <w:t>尚未實作</w:t>
+              <w:t>已實作</w:t>
             </w:r>
           </w:p>
         </w:tc>
@@ -491,7 +491,7 @@
                 <w:color w:val="000000"/>
                 <w:sz w:val="21"/>
               </w:rPr>
-              <w:t>尚未實作</w:t>
+              <w:t>已實作</w:t>
             </w:r>
           </w:p>
         </w:tc>
@@ -3096,7 +3096,7 @@
                 <w:color w:val="000000"/>
                 <w:sz w:val="21"/>
               </w:rPr>
-              <w:t>保留未指定欄位，驗證候選完整課程；不得變更 id 或增加額外欄位。已有選課不直接阻擋修改。</w:t>
+              <w:t>先拒絕空 changes、含 id（即使同值）及額外欄位；保留未指定欄位並驗證候選完整課程。已有選課不直接阻擋修改。</w:t>
             </w:r>
           </w:p>
         </w:tc>
@@ -3190,7 +3190,7 @@
                 <w:color w:val="000000"/>
                 <w:sz w:val="21"/>
               </w:rPr>
-              <w:t>目標不存在、參數或候選資料不合法、禁止的欄位變更時 False。</w:t>
+              <w:t>空 changes、含 id、目標不存在或參數／候選資料不合法時 False。</w:t>
             </w:r>
           </w:p>
         </w:tc>
@@ -7036,7 +7036,7 @@
           <w:color w:val="000000"/>
           <w:sz w:val="22"/>
         </w:rPr>
-        <w:t>空 changes 的回傳語意，以及 changes 夾帶與原值相同 id 的處理，維持待確認。確認前使用有實際變更欄位且不含 id 的 changes。</w:t>
+        <w:t>學生修改的空 changes 與夾帶同值 id 處理仍待確認；確認前使用有實際變更欄位且不含 id 的 changes。課程修改依 update_course 表格處理。</w:t>
       </w:r>
     </w:p>
     <w:p>
@@ -7058,7 +7058,7 @@
           <w:color w:val="000000"/>
           <w:sz w:val="18"/>
         </w:rPr>
-        <w:t>來源：SDD 3.1 與 2026/10/16 已確認決策。契約版本維持 1.0，本次文件修訂為 1.2。</w:t>
+        <w:t>來源：SDD 3.1 與 2026/10/16 已確認決策。契約版本為 1.1，本次文件修訂為 1.3。</w:t>
       </w:r>
     </w:p>
     <w:sectPr>
@@ -7085,7 +7085,7 @@
         <w:color w:val="000000"/>
         <w:sz w:val="18"/>
       </w:rPr>
-      <w:t xml:space="preserve">F1 契約 1.0  |  </w:t>
+      <w:t xml:space="preserve">F1 契約 1.1  |  </w:t>
     </w:r>
     <w:fldSimple w:instr="PAGE"/>
   </w:p>

</xml_diff>

<commit_message>
Implement multi-condition course search
實作課程多條件查詢功能，支援課程代號、授課教師、星期、必選修及最低剩餘名額篩選，加入查詢參數驗證、結果排序與深層複製，並同步更新函式介面實作狀態。
</commit_message>
<xml_diff>
--- a/docs/function_interface.docx
+++ b/docs/function_interface.docx
@@ -35,7 +35,7 @@
           <w:color w:val="000000"/>
           <w:sz w:val="20"/>
         </w:rPr>
-        <w:t>校園選課與課表規劃系統  |  契約 1.1  |  文件 1.3  |  2026/10/16</w:t>
+        <w:t>校園選課與課表規劃系統  |  契約 1.1  |  文件 1.4  |  2026/10/16</w:t>
       </w:r>
     </w:p>
     <w:p>
@@ -559,7 +559,7 @@
                 <w:color w:val="000000"/>
                 <w:sz w:val="21"/>
               </w:rPr>
-              <w:t>尚未實作</w:t>
+              <w:t>已實作</w:t>
             </w:r>
           </w:p>
         </w:tc>
@@ -7058,7 +7058,7 @@
           <w:color w:val="000000"/>
           <w:sz w:val="18"/>
         </w:rPr>
-        <w:t>來源：SDD 3.1 與 2026/10/16 已確認決策。契約版本為 1.1，本次文件修訂為 1.3。</w:t>
+        <w:t>來源：SDD 3.1 與 2026/10/16 已確認決策。契約版本為 1.1，本次文件修訂為 1.4。</w:t>
       </w:r>
     </w:p>
     <w:sectPr>

</xml_diff>

<commit_message>
Implement student validation and creation
實作學生資料驗證與新增功能，檢查五個必要欄位、資料型別、課程參照與重複選課，並使用深層複製避免資料意外共用，同步更新函式介面實作狀態。
</commit_message>
<xml_diff>
--- a/docs/function_interface.docx
+++ b/docs/function_interface.docx
@@ -35,7 +35,7 @@
           <w:color w:val="000000"/>
           <w:sz w:val="20"/>
         </w:rPr>
-        <w:t>校園選課與課表規劃系統  |  契約 1.1  |  文件 1.4  |  2026/10/16</w:t>
+        <w:t>校園選課與課表規劃系統  |  契約 1.1  |  文件 1.5  |  2026/10/16</w:t>
       </w:r>
     </w:p>
     <w:p>
@@ -627,7 +627,7 @@
                 <w:color w:val="000000"/>
                 <w:sz w:val="21"/>
               </w:rPr>
-              <w:t>尚未實作</w:t>
+              <w:t>已實作</w:t>
             </w:r>
           </w:p>
         </w:tc>
@@ -695,7 +695,7 @@
                 <w:color w:val="000000"/>
                 <w:sz w:val="21"/>
               </w:rPr>
-              <w:t>尚未實作</w:t>
+              <w:t>已實作</w:t>
             </w:r>
           </w:p>
         </w:tc>
@@ -7058,7 +7058,7 @@
           <w:color w:val="000000"/>
           <w:sz w:val="18"/>
         </w:rPr>
-        <w:t>來源：SDD 3.1 與 2026/10/16 已確認決策。契約版本為 1.1，本次文件修訂為 1.4。</w:t>
+        <w:t>來源：SDD 3.1 與 2026/10/16 已確認決策。契約版本為 1.1，本次文件修訂為 1.5。</w:t>
       </w:r>
     </w:p>
     <w:sectPr>

</xml_diff>

<commit_message>
Implement student update, deletion, and search
完成學生資料修改、刪除與查詢功能，包含候選資料驗證、修改失敗不變、選課關聯刪除及查詢結果深層複製。同步更新 Function Interface 的實作狀態與版本，至此完成 F1 全部 11 個公開函式。
</commit_message>
<xml_diff>
--- a/docs/function_interface.docx
+++ b/docs/function_interface.docx
@@ -35,7 +35,7 @@
           <w:color w:val="000000"/>
           <w:sz w:val="20"/>
         </w:rPr>
-        <w:t>校園選課與課表規劃系統  |  契約 1.1  |  文件 1.5  |  2026/10/16</w:t>
+        <w:t>校園選課與課表規劃系統  |  契約 1.2  |  文件 1.6  |  2026/10/16</w:t>
       </w:r>
     </w:p>
     <w:p>
@@ -763,7 +763,7 @@
                 <w:color w:val="000000"/>
                 <w:sz w:val="21"/>
               </w:rPr>
-              <w:t>尚未實作</w:t>
+              <w:t>已實作</w:t>
             </w:r>
           </w:p>
         </w:tc>
@@ -831,7 +831,7 @@
                 <w:color w:val="000000"/>
                 <w:sz w:val="21"/>
               </w:rPr>
-              <w:t>尚未實作</w:t>
+              <w:t>已實作</w:t>
             </w:r>
           </w:p>
         </w:tc>
@@ -899,7 +899,7 @@
                 <w:color w:val="000000"/>
                 <w:sz w:val="21"/>
               </w:rPr>
-              <w:t>尚未實作</w:t>
+              <w:t>已實作</w:t>
             </w:r>
           </w:p>
         </w:tc>
@@ -5955,7 +5955,7 @@
                 <w:color w:val="000000"/>
                 <w:sz w:val="21"/>
               </w:rPr>
-              <w:t>保留未指定欄位，驗證候選完整學生與課程參照；不得變更 id 或增加額外欄位。</w:t>
+              <w:t>拒絕空 changes、任何 id（即使同值）及額外欄位；保留未指定欄位，驗證候選完整學生與課程參照。</w:t>
             </w:r>
           </w:p>
         </w:tc>
@@ -6049,7 +6049,7 @@
                 <w:color w:val="000000"/>
                 <w:sz w:val="21"/>
               </w:rPr>
-              <w:t>目標不存在、參數或候選資料不合法、禁止的欄位變更時 False。</w:t>
+              <w:t>空 changes、含 id、目標不存在、參數或候選資料不合法時 False。</w:t>
             </w:r>
           </w:p>
         </w:tc>
@@ -7036,7 +7036,7 @@
           <w:color w:val="000000"/>
           <w:sz w:val="22"/>
         </w:rPr>
-        <w:t>學生修改的空 changes 與夾帶同值 id 處理仍待確認；確認前使用有實際變更欄位且不含 id 的 changes。課程修改依 update_course 表格處理。</w:t>
+        <w:t>課程與學生修改邊界已確認，分別見 update_course 與 update_student 表格。</w:t>
       </w:r>
     </w:p>
     <w:p>
@@ -7058,7 +7058,7 @@
           <w:color w:val="000000"/>
           <w:sz w:val="18"/>
         </w:rPr>
-        <w:t>來源：SDD 3.1 與 2026/10/16 已確認決策。契約版本為 1.1，本次文件修訂為 1.5。</w:t>
+        <w:t>來源：SDD 3.1 與 2026/10/16 已確認決策。契約版本為 1.2，本次文件修訂為 1.6。</w:t>
       </w:r>
     </w:p>
     <w:sectPr>
@@ -7085,7 +7085,7 @@
         <w:color w:val="000000"/>
         <w:sz w:val="18"/>
       </w:rPr>
-      <w:t xml:space="preserve">F1 契約 1.1  |  </w:t>
+      <w:t xml:space="preserve">F1 契約 1.2  |  </w:t>
     </w:r>
     <w:fldSimple w:instr="PAGE"/>
   </w:p>

</xml_diff>

<commit_message>
test: verify F2/F3 contracts and finalize interface docs
新增 76 項 F2／F3 自動化測試，涵蓋七個公開入口、合成資料核心串接及資料獨立性，補齊原學生不存在案例。
</commit_message>
<xml_diff>
--- a/docs/function_interface.docx
+++ b/docs/function_interface.docx
@@ -43,7 +43,7 @@
           <w:sz w:val="20"/>
           <w:lang w:eastAsia="zh-TW"/>
         </w:rPr>
-        <w:t>校園選課與課表規劃系統  |  F1 契約 1.2  |  文件 1.9  |  2026/10/24</w:t>
+        <w:t>校園選課與課表規劃系統  |  F1 契約 1.2  |  文件 1.11  |  2026/10/25</w:t>
       </w:r>
     </w:p>
     <w:p>
@@ -1306,7 +1306,7 @@
                 <w:color w:val="000000"/>
                 <w:sz w:val="21"/>
               </w:rPr>
-              <w:t>尚未實作</w:t>
+              <w:t>已實作</w:t>
             </w:r>
           </w:p>
         </w:tc>
@@ -1399,7 +1399,7 @@
                 <w:color w:val="000000"/>
                 <w:sz w:val="21"/>
               </w:rPr>
-              <w:t>尚未實作</w:t>
+              <w:t>已實作</w:t>
             </w:r>
           </w:p>
         </w:tc>
@@ -1492,7 +1492,7 @@
                 <w:color w:val="000000"/>
                 <w:sz w:val="21"/>
               </w:rPr>
-              <w:t>尚未實作</w:t>
+              <w:t>已實作</w:t>
             </w:r>
           </w:p>
         </w:tc>
@@ -1585,7 +1585,7 @@
                 <w:color w:val="000000"/>
                 <w:sz w:val="21"/>
               </w:rPr>
-              <w:t>尚未實作</w:t>
+              <w:t>已實作</w:t>
             </w:r>
           </w:p>
         </w:tc>
@@ -1678,7 +1678,7 @@
                 <w:color w:val="000000"/>
                 <w:sz w:val="21"/>
               </w:rPr>
-              <w:t>尚未實作</w:t>
+              <w:t>已實作</w:t>
             </w:r>
           </w:p>
         </w:tc>
@@ -1771,7 +1771,7 @@
                 <w:color w:val="000000"/>
                 <w:sz w:val="21"/>
               </w:rPr>
-              <w:t>尚未實作</w:t>
+              <w:t>已實作</w:t>
             </w:r>
           </w:p>
         </w:tc>
@@ -1864,7 +1864,7 @@
                 <w:color w:val="000000"/>
                 <w:sz w:val="21"/>
               </w:rPr>
-              <w:t>尚未實作</w:t>
+              <w:t>已實作</w:t>
             </w:r>
           </w:p>
         </w:tc>
@@ -1880,7 +1880,7 @@
         <w:rPr>
           <w:sz w:val="20"/>
         </w:rPr>
-        <w:t>F1 保留 11 個介面；F2／F3 新增 7 個，共 18 個。模組欄中 conflict.py 與 timetable.py 為規劃歸屬。</w:t>
+        <w:t>F1 保留 11 個介面；F2／F3 新增 7 個，共 18 個。conflict.py 與 timetable.py 已提供對應核心實作。</w:t>
       </w:r>
     </w:p>
     <w:p>
@@ -7723,7 +7723,7 @@
         <w:widowControl/>
       </w:pPr>
       <w:r>
-        <w:t>完全週外、部分週外或跨日活動均拋範圍錯誤。結果 week_start 僅標示該週與本入口責任；整段選課期間由呼叫端逐週檢查，資料變更後重查。</w:t>
+        <w:t>活動須完整位於指定週，允許結束於次日 00:00；週外或其餘不支援的跨日活動均拋 OUT_OF_RANGE。結果 week_start 僅標示該週與本入口責任；整段選課期間由呼叫端逐週檢查，資料變更後重查。</w:t>
       </w:r>
     </w:p>
     <w:p>
@@ -8393,7 +8393,7 @@
         <w:widowControl/>
       </w:pPr>
       <w:r>
-        <w:t>非法型別、欄位、重複代號或無效參照拋出 ValueError("INVALID_INPUT: 說明")；必要資料為 None 或缺少必要鐘點／教室資訊為 ValueError("MISSING_DATA: 說明")；活動超出支援週或跨日為 ValueError("OUT_OF_RANGE: 說明")。呼叫端只依賴固定前綴與冒號空格，不依賴說明文字；省略必要引數或未知關鍵字仍是 Python 呼叫錯誤。</w:t>
+        <w:t>非法型別、欄位、重複代號或無效參照拋出 ValueError("INVALID_INPUT: 說明")；必要資料為 None 或缺少必要鐘點／教室資訊為 ValueError("MISSING_DATA: 說明")；活動須完整位於指定週，允許結束於次日 00:00；週外或其餘不支援的跨日活動為 ValueError("OUT_OF_RANGE: 說明")。呼叫端只依賴固定前綴與冒號空格，不依賴說明文字；省略必要引數或未知關鍵字仍是 Python 呼叫錯誤。</w:t>
       </w:r>
     </w:p>
     <w:p>
@@ -8417,7 +8417,7 @@
         <w:widowControl/>
       </w:pPr>
       <w:r>
-        <w:t>活動跨日、跨週及重複活動的展開方式仍待團隊決定；不得把不支援的輸入略過。跨日課表查詢與同教室課程／課程、課程／活動、活動／活動的衝突檢查則列入本文件功能；不包含 F4 的活動管理、報名容量或場地容量設備篩選。</w:t>
+        <w:t>其餘跨日、跨週及重複活動的展開方式仍待團隊決定；不得把不支援的輸入略過。跨日課表查詢與同教室課程／課程、課程／活動、活動／活動的衝突檢查則列入本文件功能；不包含 F4 的活動管理、報名容量或場地容量設備篩選。</w:t>
       </w:r>
     </w:p>
     <w:p>
@@ -9245,7 +9245,7 @@
                 <w:color w:val="000000"/>
                 <w:sz w:val="21"/>
               </w:rPr>
-              <w:t>學生選課參照有效，目標須同日且完整在指定週；目標與教室比較所需活動 room 必須已知。個人活動資料不因學生尚無其他活動而省略，須明確傳入 []。</w:t>
+              <w:t>學生選課參照有效，目標須完整在指定週，允許結束於次日 00:00；目標與教室比較所需活動 room 必須已知。個人活動資料不因學生尚無其他活動而省略，須明確傳入 []。</w:t>
             </w:r>
           </w:p>
         </w:tc>
@@ -9392,7 +9392,7 @@
                 <w:color w:val="000000"/>
                 <w:sz w:val="21"/>
               </w:rPr>
-              <w:t>依 8.4；週外／跨日目標、未知教室或鐘點均拋例外，不以重複參加取代必要檢查。</w:t>
+              <w:t>依 8.4；週外或其餘不支援的跨日目標拋 OUT_OF_RANGE；未知教室或鐘點均拋例外，不以重複參加取代必要檢查。</w:t>
             </w:r>
           </w:p>
         </w:tc>

</xml_diff>